<commit_message>
Normalize indicator inputs and add visual function editor
</commit_message>
<xml_diff>
--- a/report.docx
+++ b/report.docx
@@ -53,7 +53,7 @@
           <w:rFonts w:ascii="Times New Roman" w:hAnsi="Times New Roman" w:eastAsia="Times New Roman" w:cs="Times New Roman"/>
           <w:color w:val="000000"/>
         </w:rPr>
-        <w:t>Основной режим воспроизводит полностью записанный численный пример из предоставленной статьи: 15 дифференциальных уравнений, их коэффициенты и начальные значения. Пользователь вводит только числа. Отдельный режим реализует символическую систему (3) с внешними факторами. Это разные записи исходника, а не две формы одной и той же системы.</w:t>
+        <w:t>Основной режим воспроизводит полностью записанный численный пример из предоставленной статьи: 15 дифференциальных уравнений, их коэффициенты и начальные значения. Начальные показатели вводятся в диапазоне 0–1. Конструктор позволяет изменять функции f и их коэффициенты. Отдельный режим реализует символическую систему (3) с внешними факторами. Это разные записи исходника, а не две формы одной и той же системы.</w:t>
       </w:r>
     </w:p>
     <w:p>
@@ -71,7 +71,16 @@
           <w:rFonts w:ascii="Times New Roman" w:hAnsi="Times New Roman" w:eastAsia="Times New Roman" w:cs="Times New Roman"/>
           <w:color w:val="000000"/>
         </w:rPr>
-        <w:t>В интерфейсе три раздела: «Расчёт», «Эксперименты», «Формулы и данные». Формулы доступны для чтения; ввод пользователя состоит из чисел и выбора настроек. Основной пример заполнен и готов к запуску.</w:t>
+        <w:t>В интерфейсе четыре раздела: «Расчёт», «Эксперименты», «Конструктор функций», «Формулы и данные». Основной пример заполнен и готов к запуску. Исходные показатели и графики представлены в нормированных значениях; пересчёт в людей и рубли включается отдельно.</w:t>
+      </w:r>
+    </w:p>
+    <w:p>
+      <w:r>
+        <w:rPr>
+          <w:rFonts w:ascii="Times New Roman" w:hAnsi="Times New Roman" w:eastAsia="Times New Roman" w:cs="Times New Roman"/>
+          <w:color w:val="000000"/>
+        </w:rPr>
+        <w:br w:type="page"/>
       </w:r>
     </w:p>
     <w:p>
@@ -107,7 +116,16 @@
           <w:rFonts w:ascii="Times New Roman" w:hAnsi="Times New Roman" w:eastAsia="Times New Roman" w:cs="Times New Roman"/>
           <w:color w:val="000000"/>
         </w:rPr>
-        <w:t>Нормировка выполняется по максимуму каждого столбца. X — безразмерные значения; Y — значения в исходных единицах. Первые два показателя относятся к людям, остальные — к денежным потерям в тысячах рублей. X₃ не складывается повторно с потерями по причинам. Дробный результат для людей является модельной величиной, а не числом зарегистрированных пострадавших.</w:t>
+        <w:t>Начальные X и цели вводятся от 0 до 1. Для суммы R в рублях X=R/(1000·M): в Excel M указан в тысячах рублей. Например, 11 230 923 500 ₽ / 22 461 847 000 ₽ = 0,5. Обратный перевод: R=1000·M·X. Графики показывают нормированные X; при выходе решения выше 1 шкала расширяется без обрезки. Максимумы одинаковы для всех экспериментов.</w:t>
+      </w:r>
+    </w:p>
+    <w:p>
+      <w:r>
+        <w:rPr>
+          <w:rFonts w:ascii="Times New Roman" w:hAnsi="Times New Roman" w:eastAsia="Times New Roman" w:cs="Times New Roman"/>
+          <w:color w:val="000000"/>
+        </w:rPr>
+        <w:t>X — безразмерный показатель. В исходной таблице Y₁, Y₂ — люди, Y₃–Y₁₅ — тысячи рублей. X₃ не складывается повторно с ущербом по причинам. Дробный результат для людей является модельной величиной.</w:t>
       </w:r>
     </w:p>
     <w:tbl>
@@ -1886,11 +1904,12 @@
           <w:rFonts w:ascii="Times New Roman" w:hAnsi="Times New Roman" w:eastAsia="Times New Roman" w:cs="Times New Roman"/>
           <w:color w:val="000000"/>
         </w:rPr>
-        <w:t>Ниже полностью приведены правые части численного блока статьи. Коэффициенты и операции сохранены буквально. Верхний индекс 2 означает квадрат. В записи исходника используются произведения полиномов; они не заменяются разностями из отдельной символической системы (3).</w:t>
+        <w:t>Ниже полностью приведены правые части численного блока статьи. В исходном режиме коэффициенты и операции сохранены буквально; результаты отчёта получены без изменений в конструкторе. Верхний индекс 2 означает квадрат. В записи исходника используются произведения полиномов; они не заменяются разностями из отдельной символической системы (3).</w:t>
       </w:r>
     </w:p>
     <w:p>
       <w:pPr>
+        <w:keepLines/>
         <w:spacing w:line="276" w:lineRule="auto"/>
         <w:ind w:firstLine="0"/>
         <w:jc w:val="left"/>
@@ -1906,6 +1925,7 @@
     </w:p>
     <w:p>
       <w:pPr>
+        <w:keepLines/>
         <w:spacing w:line="276" w:lineRule="auto"/>
         <w:ind w:firstLine="0"/>
         <w:jc w:val="left"/>
@@ -1921,6 +1941,7 @@
     </w:p>
     <w:p>
       <w:pPr>
+        <w:keepLines/>
         <w:spacing w:line="276" w:lineRule="auto"/>
         <w:ind w:firstLine="0"/>
         <w:jc w:val="left"/>
@@ -1936,6 +1957,7 @@
     </w:p>
     <w:p>
       <w:pPr>
+        <w:keepLines/>
         <w:spacing w:line="276" w:lineRule="auto"/>
         <w:ind w:firstLine="0"/>
         <w:jc w:val="left"/>
@@ -1951,6 +1973,7 @@
     </w:p>
     <w:p>
       <w:pPr>
+        <w:keepLines/>
         <w:spacing w:line="276" w:lineRule="auto"/>
         <w:ind w:firstLine="0"/>
         <w:jc w:val="left"/>
@@ -1966,6 +1989,7 @@
     </w:p>
     <w:p>
       <w:pPr>
+        <w:keepLines/>
         <w:spacing w:line="276" w:lineRule="auto"/>
         <w:ind w:firstLine="0"/>
         <w:jc w:val="left"/>
@@ -1981,6 +2005,7 @@
     </w:p>
     <w:p>
       <w:pPr>
+        <w:keepLines/>
         <w:spacing w:line="276" w:lineRule="auto"/>
         <w:ind w:firstLine="0"/>
         <w:jc w:val="left"/>
@@ -1996,6 +2021,7 @@
     </w:p>
     <w:p>
       <w:pPr>
+        <w:keepLines/>
         <w:spacing w:line="276" w:lineRule="auto"/>
         <w:ind w:firstLine="0"/>
         <w:jc w:val="left"/>
@@ -2011,6 +2037,7 @@
     </w:p>
     <w:p>
       <w:pPr>
+        <w:keepLines/>
         <w:spacing w:line="276" w:lineRule="auto"/>
         <w:ind w:firstLine="0"/>
         <w:jc w:val="left"/>
@@ -2026,6 +2053,7 @@
     </w:p>
     <w:p>
       <w:pPr>
+        <w:keepLines/>
         <w:spacing w:line="276" w:lineRule="auto"/>
         <w:ind w:firstLine="0"/>
         <w:jc w:val="left"/>
@@ -2041,6 +2069,7 @@
     </w:p>
     <w:p>
       <w:pPr>
+        <w:keepLines/>
         <w:spacing w:line="276" w:lineRule="auto"/>
         <w:ind w:firstLine="0"/>
         <w:jc w:val="left"/>
@@ -2056,6 +2085,7 @@
     </w:p>
     <w:p>
       <w:pPr>
+        <w:keepLines/>
         <w:spacing w:line="276" w:lineRule="auto"/>
         <w:ind w:firstLine="0"/>
         <w:jc w:val="left"/>
@@ -2071,6 +2101,7 @@
     </w:p>
     <w:p>
       <w:pPr>
+        <w:keepLines/>
         <w:spacing w:line="276" w:lineRule="auto"/>
         <w:ind w:firstLine="0"/>
         <w:jc w:val="left"/>
@@ -2086,6 +2117,7 @@
     </w:p>
     <w:p>
       <w:pPr>
+        <w:keepLines/>
         <w:spacing w:line="276" w:lineRule="auto"/>
         <w:ind w:firstLine="0"/>
         <w:jc w:val="left"/>
@@ -2101,6 +2133,7 @@
     </w:p>
     <w:p>
       <w:pPr>
+        <w:keepLines/>
         <w:spacing w:line="276" w:lineRule="auto"/>
         <w:ind w:firstLine="0"/>
         <w:jc w:val="left"/>
@@ -2121,15 +2154,6 @@
           <w:color w:val="000000"/>
         </w:rPr>
         <w:t>Начальное состояние указано в таблице раздела 2; X₁₀(0)=0,823 взято именно из статьи. Интервал T=0,7. В статье t=0; 0,1; …; 0,7 сопоставлены 2015–2022 годам. Шкала t не интерпретируется как минуты развития одного пожара.</w:t>
-      </w:r>
-    </w:p>
-    <w:p>
-      <w:r>
-        <w:rPr>
-          <w:rFonts w:ascii="Times New Roman" w:hAnsi="Times New Roman" w:eastAsia="Times New Roman" w:cs="Times New Roman"/>
-          <w:color w:val="000000"/>
-        </w:rPr>
-        <w:br w:type="page"/>
       </w:r>
     </w:p>
     <w:p>
@@ -2155,6 +2179,7 @@
     </w:p>
     <w:p>
       <w:pPr>
+        <w:keepLines/>
         <w:spacing w:line="276" w:lineRule="auto"/>
         <w:ind w:firstLine="0"/>
         <w:jc w:val="left"/>
@@ -2170,6 +2195,7 @@
     </w:p>
     <w:p>
       <w:pPr>
+        <w:keepLines/>
         <w:spacing w:line="276" w:lineRule="auto"/>
         <w:ind w:firstLine="0"/>
         <w:jc w:val="left"/>
@@ -2185,6 +2211,7 @@
     </w:p>
     <w:p>
       <w:pPr>
+        <w:keepLines/>
         <w:spacing w:line="276" w:lineRule="auto"/>
         <w:ind w:firstLine="0"/>
         <w:jc w:val="left"/>
@@ -2200,6 +2227,7 @@
     </w:p>
     <w:p>
       <w:pPr>
+        <w:keepLines/>
         <w:spacing w:line="276" w:lineRule="auto"/>
         <w:ind w:firstLine="0"/>
         <w:jc w:val="left"/>
@@ -2215,6 +2243,7 @@
     </w:p>
     <w:p>
       <w:pPr>
+        <w:keepLines/>
         <w:spacing w:line="276" w:lineRule="auto"/>
         <w:ind w:firstLine="0"/>
         <w:jc w:val="left"/>
@@ -2258,7 +2287,7 @@
           <w:rFonts w:ascii="Times New Roman" w:hAnsi="Times New Roman" w:eastAsia="Times New Roman" w:cs="Times New Roman"/>
           <w:color w:val="000000"/>
         </w:rPr>
-        <w:t>По умолчанию цель X* — среднее нормированных наблюдений Excel, веса γ=1/15. Это выбранный статистический ориентир и равные веса, а не утверждённые нормы. J интегрируется одновременно с системой, J(0)=0. Он не выражается в рублях; меньший J означает меньшее отклонение от той же цели при тех же весах.</w:t>
+        <w:t>Веса γ=1/15 взяты из примечания в статье. Цель X* — среднее по Excel, выбранное как статистический ориентир, не норматив. J(0)=0; критерий интегрируется вместе с системой. Меньше J — ближе к той же цели при тех же весах. J не измеряется в рублях.</w:t>
       </w:r>
     </w:p>
     <w:p>
@@ -4165,7 +4194,7 @@
           <w:rFonts w:ascii="Times New Roman" w:hAnsi="Times New Roman" w:eastAsia="Times New Roman" w:cs="Times New Roman"/>
           <w:color w:val="000000"/>
         </w:rPr>
-        <w:t>Сравниваются пять начальных состояний: текущий пример статьи и строки статистики 2016, 2018, 2020, 2022 годов. Модель, интервал, цели и веса неизменны. Пользователь может изменить текущие числа в разделе «Расчёт» и заново выполнить серию. Случайные данные не используются.</w:t>
+        <w:t>Сравниваются пять начальных состояний: текущий пример статьи и строки статистики 2016, 2018, 2020, 2022 годов. Модель, интервал, цели и веса неизменны. Пользователь может изменить текущие числа в разделе «Расчёт» и заново выполнить серию. Применённые изменения функций одинаковы для всей серии. Случайные данные не используются.</w:t>
       </w:r>
     </w:p>
     <w:tbl>
@@ -5100,7 +5129,37 @@
           <w:rFonts w:ascii="Times New Roman" w:hAnsi="Times New Roman" w:eastAsia="Times New Roman" w:cs="Times New Roman"/>
           <w:color w:val="000000"/>
         </w:rPr>
-        <w:t>10 Проверка и выводы</w:t>
+        <w:t>10 Конструктор функций</w:t>
+      </w:r>
+    </w:p>
+    <w:p>
+      <w:r>
+        <w:rPr>
+          <w:rFonts w:ascii="Times New Roman" w:hAnsi="Times New Roman" w:eastAsia="Times New Roman" w:cs="Times New Roman"/>
+          <w:color w:val="000000"/>
+        </w:rPr>
+        <w:t>В разделе «Конструктор функций» выбирают уравнение и нажимают на f в его записи. Доступны все 78 зависимостей. Можно изменить коэффициенты a, b, c, выбрать квадратичную, линейную, постоянную, экспоненциальную функцию либо ввести выражение от u. График сравнивает исходную и изменённую функции на u от 0 до 1. Кнопка «Применить к модели» подключает изменение к расчёту и всей серии; затем требуется пересчитать результат. Возврат к исходной функции предусмотрен отдельно. Пользовательские функции являются изменениями модели, а не коэффициентами из источника. Операции между функциями в системе сохраняются. Значения f и коэффициенты не ограничиваются диапазоном 0–1.</w:t>
+      </w:r>
+    </w:p>
+    <w:p>
+      <w:r>
+        <w:rPr>
+          <w:rFonts w:ascii="Times New Roman" w:hAnsi="Times New Roman" w:eastAsia="Times New Roman" w:cs="Times New Roman"/>
+          <w:color w:val="000000"/>
+        </w:rPr>
+        <w:t>Выражения проверяются безопасным арифметическим анализатором: разрешены переменная u, операции +, −, *, /, ** и функции sin, cos, exp, log, sqrt, abs. Обращение к файлам и выполнение произвольного Python-кода не допускаются. Ошибки области определения показываются пользователю.</w:t>
+      </w:r>
+    </w:p>
+    <w:p>
+      <w:pPr>
+        <w:pStyle w:val="Heading1"/>
+      </w:pPr>
+      <w:r>
+        <w:rPr>
+          <w:rFonts w:ascii="Times New Roman" w:hAnsi="Times New Roman" w:eastAsia="Times New Roman" w:cs="Times New Roman"/>
+          <w:color w:val="000000"/>
+        </w:rPr>
+        <w:t>11 Проверка и выводы</w:t>
       </w:r>
     </w:p>
     <w:p>
@@ -5118,7 +5177,7 @@
           <w:rFonts w:ascii="Times New Roman" w:hAnsi="Times New Roman" w:eastAsia="Times New Roman" w:cs="Times New Roman"/>
           <w:color w:val="000000"/>
         </w:rPr>
-        <w:t>Пройдено 13 автоматических проверок: исходные коэффициенты и начальные условия, единицы измерения, независимость двух режимов, отсутствие выдуманных E, валидация числового ввода, решение контрольной задачи, согласие RK4/RK45 и обновление первого эксперимента по текущим данным. Проверки подтверждают вычислительную реализацию; независимая точность прогноза для предприятия не установлена.</w:t>
+        <w:t>Пройдена 21 автоматическая проверка: исходные коэффициенты и начальные условия, единицы измерения, независимость двух режимов, отсутствие выдуманных E, валидация числового ввода, решение контрольной задачи, согласие RK4/RK45 и обновление первого эксперимента по текущим данным, сохранение 78 исходных функций, применение редактора к расчётам и всей серии, проверка диапазонов и выражений. Проверки подтверждают вычислительную реализацию; независимая точность прогноза для предприятия не установлена.</w:t>
       </w:r>
     </w:p>
     <w:p>
@@ -5154,7 +5213,7 @@
           <w:color w:val="000000"/>
           <w:sz w:val="24"/>
         </w:rPr>
-        <w:t>1. Материалы преподавателя: статистика, матрица, текст статьи. https://drive.google.com/drive/folders/16E50sw2qktwoKidohqLSN_WRUQ8epj_Q (проверено 28.10.2026).</w:t>
+        <w:t>1. Материалы преподавателя: статистика, матрица, текст статьи. https://drive.google.com/drive/folders/16E50sw2qktwoKidohqLSN_WRUQ8epj_Q (проверено 29.10.2026).</w:t>
       </w:r>
     </w:p>
     <w:p>
@@ -5169,7 +5228,7 @@
           <w:color w:val="000000"/>
           <w:sz w:val="24"/>
         </w:rPr>
-        <w:t>2. Публикация MLSD2024, с. 408–412 (девять переменных). https://mlsd2024.ipu.ru/proceedings/0408.pdf (проверено 28.10.2026).</w:t>
+        <w:t>2. Публикация MLSD2024, с. 408–412 (девять переменных). https://mlsd2024.ipu.ru/proceedings/0408.pdf (проверено 29.10.2026).</w:t>
       </w:r>
     </w:p>
     <w:p>
@@ -5184,7 +5243,7 @@
           <w:color w:val="000000"/>
           <w:sz w:val="24"/>
         </w:rPr>
-        <w:t>3. SciPy: solve_ivp / RK45. https://docs.scipy.org/doc/scipy/reference/generated/scipy.integrate.solve_ivp.html (проверено 28.10.2026).</w:t>
+        <w:t>3. SciPy: solve_ivp / RK45. https://docs.scipy.org/doc/scipy/reference/generated/scipy.integrate.solve_ivp.html (проверено 29.10.2026).</w:t>
       </w:r>
     </w:p>
     <w:p>
@@ -5199,7 +5258,22 @@
           <w:color w:val="000000"/>
           <w:sz w:val="24"/>
         </w:rPr>
-        <w:t>4. NumPy: метод наименьших квадратов. https://numpy.org/doc/stable/reference/generated/numpy.linalg.lstsq.html (проверено 28.10.2026).</w:t>
+        <w:t>4. NumPy: метод наименьших квадратов. https://numpy.org/doc/stable/reference/generated/numpy.linalg.lstsq.html (проверено 29.10.2026).</w:t>
+      </w:r>
+    </w:p>
+    <w:p>
+      <w:pPr>
+        <w:spacing w:line="240" w:lineRule="auto" w:after="80"/>
+        <w:ind w:firstLine="0"/>
+        <w:jc w:val="left"/>
+      </w:pPr>
+      <w:r>
+        <w:rPr>
+          <w:rFonts w:ascii="Times New Roman" w:hAnsi="Times New Roman" w:eastAsia="Times New Roman" w:cs="Times New Roman"/>
+          <w:color w:val="000000"/>
+          <w:sz w:val="24"/>
+        </w:rPr>
+        <w:t>5. scikit-learn: масштабирование по модулю максимума. https://scikit-learn.org/stable/modules/generated/sklearn.preprocessing.MaxAbsScaler.html (проверено 29.10.2026).</w:t>
       </w:r>
     </w:p>
     <w:sectPr>

</xml_diff>